<commit_message>
Restore white cards, add PDF download, and correct figures
Revert Experience/Contact cards to white backgrounds, switch the
Download CV button to a generated Lena_CV.pdf, and fix the TRYOUT
budget/company count and the 창업지원 supported-company total in
both the site and the CV file.
</commit_message>
<xml_diff>
--- a/이은주_CV_2026.docx
+++ b/이은주_CV_2026.docx
@@ -1832,7 +1832,7 @@
                 <w:sz w:val="19"/>
                 <w:szCs w:val="19"/>
               </w:rPr>
-              <w:t xml:space="preserve">지원기업 선정·육성 및 사업성과 관리 (89개사)</w:t>
+              <w:t xml:space="preserve">지원기업 선정·육성 및 사업성과 관리 (96개사)</w:t>
             </w:r>
           </w:p>
           <w:p>
@@ -3140,7 +3140,7 @@
                 <w:sz w:val="18"/>
                 <w:szCs w:val="18"/>
               </w:rPr>
-              <w:t xml:space="preserve">30억 원 / 18개사</w:t>
+              <w:t xml:space="preserve">6억 원 / 15개사</w:t>
             </w:r>
           </w:p>
         </w:tc>
@@ -3261,7 +3261,7 @@
           <w:sz w:val="19"/>
           <w:szCs w:val="19"/>
         </w:rPr>
-        <w:t xml:space="preserve">생년월일   </w:t>
+        <w:t xml:space="preserve">거주지   </w:t>
       </w:r>
       <w:r>
         <w:rPr>
@@ -3274,7 +3274,7 @@
           <w:sz w:val="19"/>
           <w:szCs w:val="19"/>
         </w:rPr>
-        <w:t xml:space="preserve">1986.02.28</w:t>
+        <w:t xml:space="preserve">인천시</w:t>
       </w:r>
     </w:p>
     <w:p>
@@ -3292,7 +3292,7 @@
           <w:sz w:val="19"/>
           <w:szCs w:val="19"/>
         </w:rPr>
-        <w:t xml:space="preserve">거주지   </w:t>
+        <w:t xml:space="preserve">학력   </w:t>
       </w:r>
       <w:r>
         <w:rPr>
@@ -3305,7 +3305,7 @@
           <w:sz w:val="19"/>
           <w:szCs w:val="19"/>
         </w:rPr>
-        <w:t xml:space="preserve">인천광역시 미추홀구</w:t>
+        <w:t xml:space="preserve">단국대학교 기악과 피아노 전공 (2004.03.~2008.02.)</w:t>
       </w:r>
     </w:p>
     <w:p>
@@ -3323,7 +3323,7 @@
           <w:sz w:val="19"/>
           <w:szCs w:val="19"/>
         </w:rPr>
-        <w:t xml:space="preserve">학력   </w:t>
+        <w:t xml:space="preserve">자격   </w:t>
       </w:r>
       <w:r>
         <w:rPr>
@@ -3336,7 +3336,7 @@
           <w:sz w:val="19"/>
           <w:szCs w:val="19"/>
         </w:rPr>
-        <w:t xml:space="preserve">단국대학교 기악과 피아노 전공 (2004.03.~2008.02.)</w:t>
+        <w:t xml:space="preserve">창업보육전문매니저 (2024.05.18. 취득)</w:t>
       </w:r>
     </w:p>
     <w:p>
@@ -3354,7 +3354,7 @@
           <w:sz w:val="19"/>
           <w:szCs w:val="19"/>
         </w:rPr>
-        <w:t xml:space="preserve">자격   </w:t>
+        <w:t xml:space="preserve">언어   </w:t>
       </w:r>
       <w:r>
         <w:rPr>
@@ -3367,7 +3367,53 @@
           <w:sz w:val="19"/>
           <w:szCs w:val="19"/>
         </w:rPr>
-        <w:t xml:space="preserve">창업보육전문매니저 (2024.05.18. 취득)</w:t>
+        <w:t xml:space="preserve">영어 (중급)</w:t>
+      </w:r>
+    </w:p>
+    <w:p>
+      <w:pPr>
+        <w:spacing w:after="160"/>
+      </w:pPr>
+    </w:p>
+    <w:p>
+      <w:pPr>
+        <w:pBdr>
+          <w:bottom w:val="single" w:color="E5E7EB" w:sz="4" w:space="8"/>
+        </w:pBdr>
+        <w:spacing w:after="240" w:before="360"/>
+      </w:pPr>
+      <w:r>
+        <w:rPr>
+          <w:rFonts w:ascii="Malgun Gothic" w:cs="Malgun Gothic" w:eastAsia="Malgun Gothic" w:hAnsi="Malgun Gothic"/>
+          <w:b/>
+          <w:bCs/>
+          <w:color w:val="2563EB"/>
+          <w:sz w:val="22"/>
+          <w:szCs w:val="22"/>
+        </w:rPr>
+        <w:t xml:space="preserve">■  </w:t>
+      </w:r>
+      <w:r>
+        <w:rPr>
+          <w:rFonts w:ascii="Malgun Gothic" w:cs="Malgun Gothic" w:eastAsia="Malgun Gothic" w:hAnsi="Malgun Gothic"/>
+          <w:b/>
+          <w:bCs/>
+          <w:color w:val="6B7280"/>
+          <w:sz w:val="22"/>
+          <w:szCs w:val="22"/>
+        </w:rPr>
+        <w:t xml:space="preserve">05  </w:t>
+      </w:r>
+      <w:r>
+        <w:rPr>
+          <w:rFonts w:ascii="Malgun Gothic" w:cs="Malgun Gothic" w:eastAsia="Malgun Gothic" w:hAnsi="Malgun Gothic"/>
+          <w:b/>
+          <w:bCs/>
+          <w:color w:val="1A1A1A"/>
+          <w:sz w:val="30"/>
+          <w:szCs w:val="30"/>
+        </w:rPr>
+        <w:t xml:space="preserve">Contact</w:t>
       </w:r>
     </w:p>
     <w:p>
@@ -3385,7 +3431,7 @@
           <w:sz w:val="19"/>
           <w:szCs w:val="19"/>
         </w:rPr>
-        <w:t xml:space="preserve">언어   </w:t>
+        <w:t xml:space="preserve">Name   </w:t>
       </w:r>
       <w:r>
         <w:rPr>
@@ -3398,53 +3444,7 @@
           <w:sz w:val="19"/>
           <w:szCs w:val="19"/>
         </w:rPr>
-        <w:t xml:space="preserve">영어 (중급)</w:t>
-      </w:r>
-    </w:p>
-    <w:p>
-      <w:pPr>
-        <w:spacing w:after="160"/>
-      </w:pPr>
-    </w:p>
-    <w:p>
-      <w:pPr>
-        <w:pBdr>
-          <w:bottom w:val="single" w:color="E5E7EB" w:sz="4" w:space="8"/>
-        </w:pBdr>
-        <w:spacing w:after="240" w:before="360"/>
-      </w:pPr>
-      <w:r>
-        <w:rPr>
-          <w:rFonts w:ascii="Malgun Gothic" w:cs="Malgun Gothic" w:eastAsia="Malgun Gothic" w:hAnsi="Malgun Gothic"/>
-          <w:b/>
-          <w:bCs/>
-          <w:color w:val="2563EB"/>
-          <w:sz w:val="22"/>
-          <w:szCs w:val="22"/>
-        </w:rPr>
-        <w:t xml:space="preserve">■  </w:t>
-      </w:r>
-      <w:r>
-        <w:rPr>
-          <w:rFonts w:ascii="Malgun Gothic" w:cs="Malgun Gothic" w:eastAsia="Malgun Gothic" w:hAnsi="Malgun Gothic"/>
-          <w:b/>
-          <w:bCs/>
-          <w:color w:val="6B7280"/>
-          <w:sz w:val="22"/>
-          <w:szCs w:val="22"/>
-        </w:rPr>
-        <w:t xml:space="preserve">05  </w:t>
-      </w:r>
-      <w:r>
-        <w:rPr>
-          <w:rFonts w:ascii="Malgun Gothic" w:cs="Malgun Gothic" w:eastAsia="Malgun Gothic" w:hAnsi="Malgun Gothic"/>
-          <w:b/>
-          <w:bCs/>
-          <w:color w:val="1A1A1A"/>
-          <w:sz w:val="30"/>
-          <w:szCs w:val="30"/>
-        </w:rPr>
-        <w:t xml:space="preserve">Contact</w:t>
+        <w:t xml:space="preserve">이은주 (Lena Lee)</w:t>
       </w:r>
     </w:p>
     <w:p>
@@ -3462,7 +3462,7 @@
           <w:sz w:val="19"/>
           <w:szCs w:val="19"/>
         </w:rPr>
-        <w:t xml:space="preserve">Name   </w:t>
+        <w:t xml:space="preserve">Email   </w:t>
       </w:r>
       <w:r>
         <w:rPr>
@@ -3475,69 +3475,7 @@
           <w:sz w:val="19"/>
           <w:szCs w:val="19"/>
         </w:rPr>
-        <w:t xml:space="preserve">이은주 (Lena Lee)</w:t>
-      </w:r>
-    </w:p>
-    <w:p>
-      <w:pPr>
-        <w:spacing w:after="100"/>
-      </w:pPr>
-      <w:r>
-        <w:rPr>
-          <w:rFonts w:ascii="Malgun Gothic" w:cs="Malgun Gothic" w:eastAsia="Malgun Gothic" w:hAnsi="Malgun Gothic"/>
-          <w:b/>
-          <w:bCs/>
-          <w:i w:val="false"/>
-          <w:iCs w:val="false"/>
-          <w:color w:val="6B7280"/>
-          <w:sz w:val="19"/>
-          <w:szCs w:val="19"/>
-        </w:rPr>
-        <w:t xml:space="preserve">Email   </w:t>
-      </w:r>
-      <w:r>
-        <w:rPr>
-          <w:rFonts w:ascii="Malgun Gothic" w:cs="Malgun Gothic" w:eastAsia="Malgun Gothic" w:hAnsi="Malgun Gothic"/>
-          <w:b w:val="false"/>
-          <w:bCs w:val="false"/>
-          <w:i w:val="false"/>
-          <w:iCs w:val="false"/>
-          <w:color w:val="1A1A1A"/>
-          <w:sz w:val="19"/>
-          <w:szCs w:val="19"/>
-        </w:rPr>
         <w:t xml:space="preserve">puppling@naver.com</w:t>
-      </w:r>
-    </w:p>
-    <w:p>
-      <w:pPr>
-        <w:spacing w:after="100"/>
-      </w:pPr>
-      <w:r>
-        <w:rPr>
-          <w:rFonts w:ascii="Malgun Gothic" w:cs="Malgun Gothic" w:eastAsia="Malgun Gothic" w:hAnsi="Malgun Gothic"/>
-          <w:b/>
-          <w:bCs/>
-          <w:i w:val="false"/>
-          <w:iCs w:val="false"/>
-          <w:color w:val="6B7280"/>
-          <w:sz w:val="19"/>
-          <w:szCs w:val="19"/>
-        </w:rPr>
-        <w:t xml:space="preserve">Phone   </w:t>
-      </w:r>
-      <w:r>
-        <w:rPr>
-          <w:rFonts w:ascii="Malgun Gothic" w:cs="Malgun Gothic" w:eastAsia="Malgun Gothic" w:hAnsi="Malgun Gothic"/>
-          <w:b w:val="false"/>
-          <w:bCs w:val="false"/>
-          <w:i w:val="false"/>
-          <w:iCs w:val="false"/>
-          <w:color w:val="1A1A1A"/>
-          <w:sz w:val="19"/>
-          <w:szCs w:val="19"/>
-        </w:rPr>
-        <w:t xml:space="preserve">010-2805-3595</w:t>
       </w:r>
     </w:p>
     <w:sectPr>

</xml_diff>

<commit_message>
Split 2011-2019 Experience entry into detailed 2011-2015 and 2016-2019 roles
Add the full 2011-2015 responsibilities (budget, board, external
affairs, PR) as nine task groups on the site and in the CV, and
regenerate Lena_CV.pdf from the updated source.
</commit_message>
<xml_diff>
--- a/이은주_CV_2026.docx
+++ b/이은주_CV_2026.docx
@@ -1107,7 +1107,7 @@
                 <w:sz w:val="22"/>
                 <w:szCs w:val="22"/>
               </w:rPr>
-              <w:t xml:space="preserve">2011–2019   </w:t>
+              <w:t xml:space="preserve">2011–2015   </w:t>
             </w:r>
             <w:r>
               <w:rPr>
@@ -1120,7 +1120,708 @@
                 <w:sz w:val="22"/>
                 <w:szCs w:val="22"/>
               </w:rPr>
-              <w:t xml:space="preserve">경영기획·성과관리</w:t>
+              <w:t xml:space="preserve">경영기획·예산·대외협력·기관홍보</w:t>
+            </w:r>
+          </w:p>
+          <w:p>
+            <w:pPr>
+              <w:spacing w:after="160" w:before="0"/>
+            </w:pPr>
+            <w:r>
+              <w:rPr>
+                <w:rFonts w:ascii="Malgun Gothic" w:cs="Malgun Gothic" w:eastAsia="Malgun Gothic" w:hAnsi="Malgun Gothic"/>
+                <w:b w:val="false"/>
+                <w:bCs w:val="false"/>
+                <w:i w:val="false"/>
+                <w:iCs w:val="false"/>
+                <w:color w:val="6B7280"/>
+                <w:sz w:val="19"/>
+                <w:szCs w:val="19"/>
+              </w:rPr>
+              <w:t xml:space="preserve">기관 예산과 경영평가부터 이사회, 의회·지자체 대응, 조직관리, 기관홍보까지 기관 운영 전반의 실무를 담당했습니다.</w:t>
+            </w:r>
+          </w:p>
+          <w:p>
+            <w:pPr>
+              <w:spacing w:after="80" w:before="0"/>
+            </w:pPr>
+            <w:r>
+              <w:rPr>
+                <w:rFonts w:ascii="Malgun Gothic" w:cs="Malgun Gothic" w:eastAsia="Malgun Gothic" w:hAnsi="Malgun Gothic"/>
+                <w:b/>
+                <w:bCs/>
+                <w:i w:val="false"/>
+                <w:iCs w:val="false"/>
+                <w:color w:val="6B7280"/>
+                <w:sz w:val="17"/>
+                <w:szCs w:val="17"/>
+              </w:rPr>
+              <w:t xml:space="preserve">주요 업무</w:t>
+            </w:r>
+          </w:p>
+          <w:p>
+            <w:pPr>
+              <w:spacing w:after="40" w:before="0"/>
+            </w:pPr>
+            <w:r>
+              <w:rPr>
+                <w:rFonts w:ascii="Malgun Gothic" w:cs="Malgun Gothic" w:eastAsia="Malgun Gothic" w:hAnsi="Malgun Gothic"/>
+                <w:b/>
+                <w:bCs/>
+                <w:i w:val="false"/>
+                <w:iCs w:val="false"/>
+                <w:color w:val="1A1A1A"/>
+                <w:sz w:val="19"/>
+                <w:szCs w:val="19"/>
+              </w:rPr>
+              <w:t xml:space="preserve">1. 예산·재정 관리</w:t>
+            </w:r>
+          </w:p>
+          <w:p>
+            <w:pPr>
+              <w:pStyle w:val="ListParagraph"/>
+              <w:numPr>
+                <w:ilvl w:val="0"/>
+                <w:numId w:val="2"/>
+              </w:numPr>
+              <w:spacing w:after="60"/>
+            </w:pPr>
+            <w:r>
+              <w:rPr>
+                <w:rFonts w:ascii="Malgun Gothic" w:cs="Malgun Gothic" w:eastAsia="Malgun Gothic" w:hAnsi="Malgun Gothic"/>
+                <w:b w:val="false"/>
+                <w:bCs w:val="false"/>
+                <w:i w:val="false"/>
+                <w:iCs w:val="false"/>
+                <w:color w:val="1A1A1A"/>
+                <w:sz w:val="19"/>
+                <w:szCs w:val="19"/>
+              </w:rPr>
+              <w:t xml:space="preserve">인천시 출연금 예산 확보 및 정산(연간 약 40억 원 규모), 법인 본예산·추경·결산 등 예산 편성 및 관리</w:t>
+            </w:r>
+          </w:p>
+          <w:p>
+            <w:pPr>
+              <w:spacing w:after="60"/>
+            </w:pPr>
+          </w:p>
+          <w:p>
+            <w:pPr>
+              <w:spacing w:after="40" w:before="0"/>
+            </w:pPr>
+            <w:r>
+              <w:rPr>
+                <w:rFonts w:ascii="Malgun Gothic" w:cs="Malgun Gothic" w:eastAsia="Malgun Gothic" w:hAnsi="Malgun Gothic"/>
+                <w:b/>
+                <w:bCs/>
+                <w:i w:val="false"/>
+                <w:iCs w:val="false"/>
+                <w:color w:val="1A1A1A"/>
+                <w:sz w:val="19"/>
+                <w:szCs w:val="19"/>
+              </w:rPr>
+              <w:t xml:space="preserve">2. 경영평가 및 경영성과 관리</w:t>
+            </w:r>
+          </w:p>
+          <w:p>
+            <w:pPr>
+              <w:pStyle w:val="ListParagraph"/>
+              <w:numPr>
+                <w:ilvl w:val="0"/>
+                <w:numId w:val="2"/>
+              </w:numPr>
+              <w:spacing w:after="60"/>
+            </w:pPr>
+            <w:r>
+              <w:rPr>
+                <w:rFonts w:ascii="Malgun Gothic" w:cs="Malgun Gothic" w:eastAsia="Malgun Gothic" w:hAnsi="Malgun Gothic"/>
+                <w:b w:val="false"/>
+                <w:bCs w:val="false"/>
+                <w:i w:val="false"/>
+                <w:iCs w:val="false"/>
+                <w:color w:val="1A1A1A"/>
+                <w:sz w:val="19"/>
+                <w:szCs w:val="19"/>
+              </w:rPr>
+              <w:t xml:space="preserve">인천광역시 경영평가 및 CEO 경영평가 대응, 경영실적보고서 작성 및 평가자료 관리</w:t>
+            </w:r>
+          </w:p>
+          <w:p>
+            <w:pPr>
+              <w:spacing w:after="60"/>
+            </w:pPr>
+          </w:p>
+          <w:p>
+            <w:pPr>
+              <w:spacing w:after="40" w:before="0"/>
+            </w:pPr>
+            <w:r>
+              <w:rPr>
+                <w:rFonts w:ascii="Malgun Gothic" w:cs="Malgun Gothic" w:eastAsia="Malgun Gothic" w:hAnsi="Malgun Gothic"/>
+                <w:b/>
+                <w:bCs/>
+                <w:i w:val="false"/>
+                <w:iCs w:val="false"/>
+                <w:color w:val="1A1A1A"/>
+                <w:sz w:val="19"/>
+                <w:szCs w:val="19"/>
+              </w:rPr>
+              <w:t xml:space="preserve">3. 이사회 및 주요 경영안건 관리</w:t>
+            </w:r>
+          </w:p>
+          <w:p>
+            <w:pPr>
+              <w:pStyle w:val="ListParagraph"/>
+              <w:numPr>
+                <w:ilvl w:val="0"/>
+                <w:numId w:val="2"/>
+              </w:numPr>
+              <w:spacing w:after="60"/>
+            </w:pPr>
+            <w:r>
+              <w:rPr>
+                <w:rFonts w:ascii="Malgun Gothic" w:cs="Malgun Gothic" w:eastAsia="Malgun Gothic" w:hAnsi="Malgun Gothic"/>
+                <w:b w:val="false"/>
+                <w:bCs w:val="false"/>
+                <w:i w:val="false"/>
+                <w:iCs w:val="false"/>
+                <w:color w:val="1A1A1A"/>
+                <w:sz w:val="19"/>
+                <w:szCs w:val="19"/>
+              </w:rPr>
+              <w:t xml:space="preserve">법인 이사회 구성·변경, 안건 작성 및 개최 등 이사회 운영과 주요 경영현안 관리</w:t>
+            </w:r>
+          </w:p>
+          <w:p>
+            <w:pPr>
+              <w:spacing w:after="60"/>
+            </w:pPr>
+          </w:p>
+          <w:p>
+            <w:pPr>
+              <w:spacing w:after="40" w:before="0"/>
+            </w:pPr>
+            <w:r>
+              <w:rPr>
+                <w:rFonts w:ascii="Malgun Gothic" w:cs="Malgun Gothic" w:eastAsia="Malgun Gothic" w:hAnsi="Malgun Gothic"/>
+                <w:b/>
+                <w:bCs/>
+                <w:i w:val="false"/>
+                <w:iCs w:val="false"/>
+                <w:color w:val="1A1A1A"/>
+                <w:sz w:val="19"/>
+                <w:szCs w:val="19"/>
+              </w:rPr>
+              <w:t xml:space="preserve">4. 대외협력 및 의회 대응</w:t>
+            </w:r>
+          </w:p>
+          <w:p>
+            <w:pPr>
+              <w:pStyle w:val="ListParagraph"/>
+              <w:numPr>
+                <w:ilvl w:val="0"/>
+                <w:numId w:val="2"/>
+              </w:numPr>
+              <w:spacing w:after="60"/>
+            </w:pPr>
+            <w:r>
+              <w:rPr>
+                <w:rFonts w:ascii="Malgun Gothic" w:cs="Malgun Gothic" w:eastAsia="Malgun Gothic" w:hAnsi="Malgun Gothic"/>
+                <w:b w:val="false"/>
+                <w:bCs w:val="false"/>
+                <w:i w:val="false"/>
+                <w:iCs w:val="false"/>
+                <w:color w:val="1A1A1A"/>
+                <w:sz w:val="19"/>
+                <w:szCs w:val="19"/>
+              </w:rPr>
+              <w:t xml:space="preserve">인천시·인천시의회 업무보고 및 행정사무감사 대응</w:t>
+            </w:r>
+          </w:p>
+          <w:p>
+            <w:pPr>
+              <w:pStyle w:val="ListParagraph"/>
+              <w:numPr>
+                <w:ilvl w:val="0"/>
+                <w:numId w:val="2"/>
+              </w:numPr>
+              <w:spacing w:after="60"/>
+            </w:pPr>
+            <w:r>
+              <w:rPr>
+                <w:rFonts w:ascii="Malgun Gothic" w:cs="Malgun Gothic" w:eastAsia="Malgun Gothic" w:hAnsi="Malgun Gothic"/>
+                <w:b w:val="false"/>
+                <w:bCs w:val="false"/>
+                <w:i w:val="false"/>
+                <w:iCs w:val="false"/>
+                <w:color w:val="1A1A1A"/>
+                <w:sz w:val="19"/>
+                <w:szCs w:val="19"/>
+              </w:rPr>
+              <w:t xml:space="preserve">경영혁신방안 등 주요 현안자료 작성 및 유관부서·이해관계자 대응</w:t>
+            </w:r>
+          </w:p>
+          <w:p>
+            <w:pPr>
+              <w:pStyle w:val="ListParagraph"/>
+              <w:numPr>
+                <w:ilvl w:val="0"/>
+                <w:numId w:val="2"/>
+              </w:numPr>
+              <w:spacing w:after="60"/>
+            </w:pPr>
+            <w:r>
+              <w:rPr>
+                <w:rFonts w:ascii="Malgun Gothic" w:cs="Malgun Gothic" w:eastAsia="Malgun Gothic" w:hAnsi="Malgun Gothic"/>
+                <w:b w:val="false"/>
+                <w:bCs w:val="false"/>
+                <w:i w:val="false"/>
+                <w:iCs w:val="false"/>
+                <w:color w:val="1A1A1A"/>
+                <w:sz w:val="19"/>
+                <w:szCs w:val="19"/>
+              </w:rPr>
+              <w:t xml:space="preserve">기관 MOU 체결</w:t>
+            </w:r>
+          </w:p>
+          <w:p>
+            <w:pPr>
+              <w:spacing w:after="60"/>
+            </w:pPr>
+          </w:p>
+          <w:p>
+            <w:pPr>
+              <w:spacing w:after="40" w:before="0"/>
+            </w:pPr>
+            <w:r>
+              <w:rPr>
+                <w:rFonts w:ascii="Malgun Gothic" w:cs="Malgun Gothic" w:eastAsia="Malgun Gothic" w:hAnsi="Malgun Gothic"/>
+                <w:b/>
+                <w:bCs/>
+                <w:i w:val="false"/>
+                <w:iCs w:val="false"/>
+                <w:color w:val="1A1A1A"/>
+                <w:sz w:val="19"/>
+                <w:szCs w:val="19"/>
+              </w:rPr>
+              <w:t xml:space="preserve">5. 법인 제도·규정 및 경영공시 관리</w:t>
+            </w:r>
+          </w:p>
+          <w:p>
+            <w:pPr>
+              <w:pStyle w:val="ListParagraph"/>
+              <w:numPr>
+                <w:ilvl w:val="0"/>
+                <w:numId w:val="2"/>
+              </w:numPr>
+              <w:spacing w:after="60"/>
+            </w:pPr>
+            <w:r>
+              <w:rPr>
+                <w:rFonts w:ascii="Malgun Gothic" w:cs="Malgun Gothic" w:eastAsia="Malgun Gothic" w:hAnsi="Malgun Gothic"/>
+                <w:b w:val="false"/>
+                <w:bCs w:val="false"/>
+                <w:i w:val="false"/>
+                <w:iCs w:val="false"/>
+                <w:color w:val="1A1A1A"/>
+                <w:sz w:val="19"/>
+                <w:szCs w:val="19"/>
+              </w:rPr>
+              <w:t xml:space="preserve">기관 설립조례, 정관·규정·규칙 및 경영공시 관련 업무 관리</w:t>
+            </w:r>
+          </w:p>
+          <w:p>
+            <w:pPr>
+              <w:spacing w:after="60"/>
+            </w:pPr>
+          </w:p>
+          <w:p>
+            <w:pPr>
+              <w:spacing w:after="40" w:before="0"/>
+            </w:pPr>
+            <w:r>
+              <w:rPr>
+                <w:rFonts w:ascii="Malgun Gothic" w:cs="Malgun Gothic" w:eastAsia="Malgun Gothic" w:hAnsi="Malgun Gothic"/>
+                <w:b/>
+                <w:bCs/>
+                <w:i w:val="false"/>
+                <w:iCs w:val="false"/>
+                <w:color w:val="1A1A1A"/>
+                <w:sz w:val="19"/>
+                <w:szCs w:val="19"/>
+              </w:rPr>
+              <w:t xml:space="preserve">6. 조직 및 경영회의 운영</w:t>
+            </w:r>
+          </w:p>
+          <w:p>
+            <w:pPr>
+              <w:pStyle w:val="ListParagraph"/>
+              <w:numPr>
+                <w:ilvl w:val="0"/>
+                <w:numId w:val="2"/>
+              </w:numPr>
+              <w:spacing w:after="60"/>
+            </w:pPr>
+            <w:r>
+              <w:rPr>
+                <w:rFonts w:ascii="Malgun Gothic" w:cs="Malgun Gothic" w:eastAsia="Malgun Gothic" w:hAnsi="Malgun Gothic"/>
+                <w:b w:val="false"/>
+                <w:bCs w:val="false"/>
+                <w:i w:val="false"/>
+                <w:iCs w:val="false"/>
+                <w:color w:val="1A1A1A"/>
+                <w:sz w:val="19"/>
+                <w:szCs w:val="19"/>
+              </w:rPr>
+              <w:t xml:space="preserve">정기 본부·부장회의, 신년 업무보고, 연간 주요실적 및 중장기 업무보고 등 주요 경영회의 운영</w:t>
+            </w:r>
+          </w:p>
+          <w:p>
+            <w:pPr>
+              <w:pStyle w:val="ListParagraph"/>
+              <w:numPr>
+                <w:ilvl w:val="0"/>
+                <w:numId w:val="2"/>
+              </w:numPr>
+              <w:spacing w:after="60"/>
+            </w:pPr>
+            <w:r>
+              <w:rPr>
+                <w:rFonts w:ascii="Malgun Gothic" w:cs="Malgun Gothic" w:eastAsia="Malgun Gothic" w:hAnsi="Malgun Gothic"/>
+                <w:b w:val="false"/>
+                <w:bCs w:val="false"/>
+                <w:i w:val="false"/>
+                <w:iCs w:val="false"/>
+                <w:color w:val="1A1A1A"/>
+                <w:sz w:val="19"/>
+                <w:szCs w:val="19"/>
+              </w:rPr>
+              <w:t xml:space="preserve">조직개편 TFT 지원</w:t>
+            </w:r>
+          </w:p>
+          <w:p>
+            <w:pPr>
+              <w:spacing w:after="60"/>
+            </w:pPr>
+          </w:p>
+          <w:p>
+            <w:pPr>
+              <w:spacing w:after="40" w:before="0"/>
+            </w:pPr>
+            <w:r>
+              <w:rPr>
+                <w:rFonts w:ascii="Malgun Gothic" w:cs="Malgun Gothic" w:eastAsia="Malgun Gothic" w:hAnsi="Malgun Gothic"/>
+                <w:b/>
+                <w:bCs/>
+                <w:i w:val="false"/>
+                <w:iCs w:val="false"/>
+                <w:color w:val="1A1A1A"/>
+                <w:sz w:val="19"/>
+                <w:szCs w:val="19"/>
+              </w:rPr>
+              <w:t xml:space="preserve">7. 기관 홍보 및 대외 커뮤니케이션</w:t>
+            </w:r>
+          </w:p>
+          <w:p>
+            <w:pPr>
+              <w:pStyle w:val="ListParagraph"/>
+              <w:numPr>
+                <w:ilvl w:val="0"/>
+                <w:numId w:val="2"/>
+              </w:numPr>
+              <w:spacing w:after="60"/>
+            </w:pPr>
+            <w:r>
+              <w:rPr>
+                <w:rFonts w:ascii="Malgun Gothic" w:cs="Malgun Gothic" w:eastAsia="Malgun Gothic" w:hAnsi="Malgun Gothic"/>
+                <w:b w:val="false"/>
+                <w:bCs w:val="false"/>
+                <w:i w:val="false"/>
+                <w:iCs w:val="false"/>
+                <w:color w:val="1A1A1A"/>
+                <w:sz w:val="19"/>
+                <w:szCs w:val="19"/>
+              </w:rPr>
+              <w:t xml:space="preserve">뉴스레터·브로슈어·백서·홍보영상·CI 등 홍보자료 제작 및 관리</w:t>
+            </w:r>
+          </w:p>
+          <w:p>
+            <w:pPr>
+              <w:pStyle w:val="ListParagraph"/>
+              <w:numPr>
+                <w:ilvl w:val="0"/>
+                <w:numId w:val="2"/>
+              </w:numPr>
+              <w:spacing w:after="60"/>
+            </w:pPr>
+            <w:r>
+              <w:rPr>
+                <w:rFonts w:ascii="Malgun Gothic" w:cs="Malgun Gothic" w:eastAsia="Malgun Gothic" w:hAnsi="Malgun Gothic"/>
+                <w:b w:val="false"/>
+                <w:bCs w:val="false"/>
+                <w:i w:val="false"/>
+                <w:iCs w:val="false"/>
+                <w:color w:val="1A1A1A"/>
+                <w:sz w:val="19"/>
+                <w:szCs w:val="19"/>
+              </w:rPr>
+              <w:t xml:space="preserve">홈페이지·블로그·페이스북·유튜브 등 홍보채널 운영</w:t>
+            </w:r>
+          </w:p>
+          <w:p>
+            <w:pPr>
+              <w:spacing w:after="60"/>
+            </w:pPr>
+          </w:p>
+          <w:p>
+            <w:pPr>
+              <w:spacing w:after="40" w:before="0"/>
+            </w:pPr>
+            <w:r>
+              <w:rPr>
+                <w:rFonts w:ascii="Malgun Gothic" w:cs="Malgun Gothic" w:eastAsia="Malgun Gothic" w:hAnsi="Malgun Gothic"/>
+                <w:b/>
+                <w:bCs/>
+                <w:i w:val="false"/>
+                <w:iCs w:val="false"/>
+                <w:color w:val="1A1A1A"/>
+                <w:sz w:val="19"/>
+                <w:szCs w:val="19"/>
+              </w:rPr>
+              <w:t xml:space="preserve">8. 언론 및 기관장 대외홍보</w:t>
+            </w:r>
+          </w:p>
+          <w:p>
+            <w:pPr>
+              <w:pStyle w:val="ListParagraph"/>
+              <w:numPr>
+                <w:ilvl w:val="0"/>
+                <w:numId w:val="2"/>
+              </w:numPr>
+              <w:spacing w:after="60"/>
+            </w:pPr>
+            <w:r>
+              <w:rPr>
+                <w:rFonts w:ascii="Malgun Gothic" w:cs="Malgun Gothic" w:eastAsia="Malgun Gothic" w:hAnsi="Malgun Gothic"/>
+                <w:b w:val="false"/>
+                <w:bCs w:val="false"/>
+                <w:i w:val="false"/>
+                <w:iCs w:val="false"/>
+                <w:color w:val="1A1A1A"/>
+                <w:sz w:val="19"/>
+                <w:szCs w:val="19"/>
+              </w:rPr>
+              <w:t xml:space="preserve">보도자료 작성·검수·배포, 언론사 및 기자 대응</w:t>
+            </w:r>
+          </w:p>
+          <w:p>
+            <w:pPr>
+              <w:pStyle w:val="ListParagraph"/>
+              <w:numPr>
+                <w:ilvl w:val="0"/>
+                <w:numId w:val="2"/>
+              </w:numPr>
+              <w:spacing w:after="60"/>
+            </w:pPr>
+            <w:r>
+              <w:rPr>
+                <w:rFonts w:ascii="Malgun Gothic" w:cs="Malgun Gothic" w:eastAsia="Malgun Gothic" w:hAnsi="Malgun Gothic"/>
+                <w:b w:val="false"/>
+                <w:bCs w:val="false"/>
+                <w:i w:val="false"/>
+                <w:iCs w:val="false"/>
+                <w:color w:val="1A1A1A"/>
+                <w:sz w:val="19"/>
+                <w:szCs w:val="19"/>
+              </w:rPr>
+              <w:t xml:space="preserve">기자간담회 운영</w:t>
+            </w:r>
+          </w:p>
+          <w:p>
+            <w:pPr>
+              <w:pStyle w:val="ListParagraph"/>
+              <w:numPr>
+                <w:ilvl w:val="0"/>
+                <w:numId w:val="2"/>
+              </w:numPr>
+              <w:spacing w:after="60"/>
+            </w:pPr>
+            <w:r>
+              <w:rPr>
+                <w:rFonts w:ascii="Malgun Gothic" w:cs="Malgun Gothic" w:eastAsia="Malgun Gothic" w:hAnsi="Malgun Gothic"/>
+                <w:b w:val="false"/>
+                <w:bCs w:val="false"/>
+                <w:i w:val="false"/>
+                <w:iCs w:val="false"/>
+                <w:color w:val="1A1A1A"/>
+                <w:sz w:val="19"/>
+                <w:szCs w:val="19"/>
+              </w:rPr>
+              <w:t xml:space="preserve">기관장 인터뷰·기고문·대외행사 인사말 및 의전 지원</w:t>
+            </w:r>
+          </w:p>
+          <w:p>
+            <w:pPr>
+              <w:spacing w:after="60"/>
+            </w:pPr>
+          </w:p>
+          <w:p>
+            <w:pPr>
+              <w:spacing w:after="40" w:before="0"/>
+            </w:pPr>
+            <w:r>
+              <w:rPr>
+                <w:rFonts w:ascii="Malgun Gothic" w:cs="Malgun Gothic" w:eastAsia="Malgun Gothic" w:hAnsi="Malgun Gothic"/>
+                <w:b/>
+                <w:bCs/>
+                <w:i w:val="false"/>
+                <w:iCs w:val="false"/>
+                <w:color w:val="1A1A1A"/>
+                <w:sz w:val="19"/>
+                <w:szCs w:val="19"/>
+              </w:rPr>
+              <w:t xml:space="preserve">9. 기관 운영 및 제도 개선</w:t>
+            </w:r>
+          </w:p>
+          <w:p>
+            <w:pPr>
+              <w:pStyle w:val="ListParagraph"/>
+              <w:numPr>
+                <w:ilvl w:val="0"/>
+                <w:numId w:val="2"/>
+              </w:numPr>
+              <w:spacing w:after="60"/>
+            </w:pPr>
+            <w:r>
+              <w:rPr>
+                <w:rFonts w:ascii="Malgun Gothic" w:cs="Malgun Gothic" w:eastAsia="Malgun Gothic" w:hAnsi="Malgun Gothic"/>
+                <w:b w:val="false"/>
+                <w:bCs w:val="false"/>
+                <w:i w:val="false"/>
+                <w:iCs w:val="false"/>
+                <w:color w:val="1A1A1A"/>
+                <w:sz w:val="19"/>
+                <w:szCs w:val="19"/>
+              </w:rPr>
+              <w:t xml:space="preserve">전자문서 시스템 관리</w:t>
+            </w:r>
+          </w:p>
+          <w:p>
+            <w:pPr>
+              <w:pStyle w:val="ListParagraph"/>
+              <w:numPr>
+                <w:ilvl w:val="0"/>
+                <w:numId w:val="2"/>
+              </w:numPr>
+              <w:spacing w:after="60"/>
+            </w:pPr>
+            <w:r>
+              <w:rPr>
+                <w:rFonts w:ascii="Malgun Gothic" w:cs="Malgun Gothic" w:eastAsia="Malgun Gothic" w:hAnsi="Malgun Gothic"/>
+                <w:b w:val="false"/>
+                <w:bCs w:val="false"/>
+                <w:i w:val="false"/>
+                <w:iCs w:val="false"/>
+                <w:color w:val="1A1A1A"/>
+                <w:sz w:val="19"/>
+                <w:szCs w:val="19"/>
+              </w:rPr>
+              <w:t xml:space="preserve">정부 3.0 관련 개인정보보호·공공데이터 업무</w:t>
+            </w:r>
+          </w:p>
+          <w:p>
+            <w:pPr>
+              <w:pStyle w:val="ListParagraph"/>
+              <w:numPr>
+                <w:ilvl w:val="0"/>
+                <w:numId w:val="2"/>
+              </w:numPr>
+              <w:spacing w:after="60"/>
+            </w:pPr>
+            <w:r>
+              <w:rPr>
+                <w:rFonts w:ascii="Malgun Gothic" w:cs="Malgun Gothic" w:eastAsia="Malgun Gothic" w:hAnsi="Malgun Gothic"/>
+                <w:b w:val="false"/>
+                <w:bCs w:val="false"/>
+                <w:i w:val="false"/>
+                <w:iCs w:val="false"/>
+                <w:color w:val="1A1A1A"/>
+                <w:sz w:val="19"/>
+                <w:szCs w:val="19"/>
+              </w:rPr>
+              <w:t xml:space="preserve">집중근무시간제 제정·운영 및 주요 현안 대응</w:t>
+            </w:r>
+          </w:p>
+        </w:tc>
+      </w:tr>
+    </w:tbl>
+    <w:p>
+      <w:pPr>
+        <w:spacing w:after="240"/>
+      </w:pPr>
+    </w:p>
+    <w:tbl>
+      <w:tblPr>
+        <w:tblW w:type="dxa" w:w="10080"/>
+        <w:tblBorders>
+          <w:top w:val="single" w:color="auto" w:sz="4"/>
+          <w:left w:val="single" w:color="auto" w:sz="4"/>
+          <w:bottom w:val="single" w:color="auto" w:sz="4"/>
+          <w:right w:val="single" w:color="auto" w:sz="4"/>
+          <w:insideH w:val="single" w:color="auto" w:sz="4"/>
+          <w:insideV w:val="single" w:color="auto" w:sz="4"/>
+        </w:tblBorders>
+      </w:tblPr>
+      <w:tblGrid>
+        <w:gridCol w:w="10080"/>
+      </w:tblGrid>
+      <w:tr>
+        <w:tc>
+          <w:tcPr>
+            <w:tcW w:type="dxa" w:w="10080"/>
+            <w:tcBorders>
+              <w:top w:val="single" w:color="E5E7EB" w:sz="4"/>
+              <w:left w:val="single" w:color="E5E7EB" w:sz="4"/>
+              <w:bottom w:val="single" w:color="E5E7EB" w:sz="4"/>
+              <w:right w:val="single" w:color="E5E7EB" w:sz="4"/>
+            </w:tcBorders>
+            <w:shd w:fill="F9FAFB" w:color="auto" w:val="clear"/>
+            <w:tcMar>
+              <w:top w:type="dxa" w:w="200"/>
+              <w:left w:type="dxa" w:w="220"/>
+              <w:bottom w:type="dxa" w:w="200"/>
+              <w:right w:type="dxa" w:w="220"/>
+            </w:tcMar>
+          </w:tcPr>
+          <w:p>
+            <w:pPr>
+              <w:spacing w:after="120" w:before="0"/>
+            </w:pPr>
+            <w:r>
+              <w:rPr>
+                <w:rFonts w:ascii="Malgun Gothic" w:cs="Malgun Gothic" w:eastAsia="Malgun Gothic" w:hAnsi="Malgun Gothic"/>
+                <w:b/>
+                <w:bCs/>
+                <w:i w:val="false"/>
+                <w:iCs w:val="false"/>
+                <w:color w:val="1A1A1A"/>
+                <w:sz w:val="22"/>
+                <w:szCs w:val="22"/>
+              </w:rPr>
+              <w:t xml:space="preserve">2016–2019   </w:t>
+            </w:r>
+            <w:r>
+              <w:rPr>
+                <w:rFonts w:ascii="Malgun Gothic" w:cs="Malgun Gothic" w:eastAsia="Malgun Gothic" w:hAnsi="Malgun Gothic"/>
+                <w:b/>
+                <w:bCs/>
+                <w:i w:val="false"/>
+                <w:iCs w:val="false"/>
+                <w:color w:val="1A1A1A"/>
+                <w:sz w:val="22"/>
+                <w:szCs w:val="22"/>
+              </w:rPr>
+              <w:t xml:space="preserve">경영기획·사업성과관리</w:t>
             </w:r>
           </w:p>
           <w:p>

</xml_diff>

<commit_message>
Rewrite About/Resume intro copy, align 2011-2016 dates, unify bullets
Update the About intro paragraphs and the 5 Resume highlight bullets
to the new wording, correct 2011-2015 to 2011-2016 everywhere
(Experience card, Career Summary detail cell, and the CV file), and
switch the 2011-2016 task groups to a heading (square bullet) + dash
sub-item structure instead of manual "1./2./..." numbers. Also split
2016-2019's MBO/KPI line into the same heading/sub-item pattern.
</commit_message>
<xml_diff>
--- a/이은주_CV_2026.docx
+++ b/이은주_CV_2026.docx
@@ -102,7 +102,7 @@
           <w:sz w:val="19"/>
           <w:szCs w:val="19"/>
         </w:rPr>
-        <w:t xml:space="preserve">공공기관에서 경영기획, 자산운용, 창업지원 업무를 2011년부터 담당해 왔습니다.</w:t>
+        <w:t xml:space="preserve">2011년부터 공공기관에서 경영기획, 자산운용, 창업지원 등 조직 운영과 사업 전반의 업무를 담당해 왔습니다.</w:t>
       </w:r>
     </w:p>
     <w:p>
@@ -120,7 +120,7 @@
           <w:sz w:val="19"/>
           <w:szCs w:val="19"/>
         </w:rPr>
-        <w:t xml:space="preserve">현재는 정부, 지자체, 공공기관, 대기업, 스타트업, 액셀러레이터·벤처캐피탈이 참여하는 창업지원 및 오픈이노베이션 사업을 기획하고 운영하고 있습니다.</w:t>
+        <w:t xml:space="preserve">현재는 정부·지자체·공공기관·대기업·스타트업·액셀러레이터·벤처캐피탈 등 다양한 이해관계자가 참여하는 창업지원 및 오픈이노베이션 사업을 기획·운영하고 있습니다.</w:t>
       </w:r>
     </w:p>
     <w:p>
@@ -313,7 +313,7 @@
           <w:sz w:val="19"/>
           <w:szCs w:val="19"/>
         </w:rPr>
-        <w:t xml:space="preserve">중앙정부, 인천광역시, 인천경제자유구역청 등 공공부문 사업 기획·운영 경험</w:t>
+        <w:t xml:space="preserve">예산관리, 이사회 운영, 대외협력 등 기관 경영 전반을 아우르는 경영관리기획 실무 경험 구축</w:t>
       </w:r>
     </w:p>
     <w:p>
@@ -336,7 +336,7 @@
           <w:sz w:val="19"/>
           <w:szCs w:val="19"/>
         </w:rPr>
-        <w:t xml:space="preserve">경영기획·성과관리 → 자산운용·임대관리 → 창업지원·민관협력으로 업무 영역 확대</w:t>
+        <w:t xml:space="preserve">중앙정부·인천광역시·인천경제자유구역청 등 공공부문 사업의 기획·운영 경험</w:t>
       </w:r>
     </w:p>
     <w:p>
@@ -359,7 +359,30 @@
           <w:sz w:val="19"/>
           <w:szCs w:val="19"/>
         </w:rPr>
-        <w:t xml:space="preserve">중소벤처기업부, 인천시, 인천경제자유구역청의 창업지원 사업을 두루 경험</w:t>
+        <w:t xml:space="preserve">경영기획·성과관리 → 자산운용·임대관리 → 창업지원·창업생태계·민관협력으로 업무 영역 확대</w:t>
+      </w:r>
+    </w:p>
+    <w:p>
+      <w:pPr>
+        <w:pStyle w:val="ListParagraph"/>
+        <w:numPr>
+          <w:ilvl w:val="0"/>
+          <w:numId w:val="2"/>
+        </w:numPr>
+        <w:spacing w:after="60"/>
+      </w:pPr>
+      <w:r>
+        <w:rPr>
+          <w:rFonts w:ascii="Malgun Gothic" w:cs="Malgun Gothic" w:eastAsia="Malgun Gothic" w:hAnsi="Malgun Gothic"/>
+          <w:b w:val="false"/>
+          <w:bCs w:val="false"/>
+          <w:i w:val="false"/>
+          <w:iCs w:val="false"/>
+          <w:color w:val="1A1A1A"/>
+          <w:sz w:val="19"/>
+          <w:szCs w:val="19"/>
+        </w:rPr>
+        <w:t xml:space="preserve">중소벤처기업부·인천광역시·인천경제자유구역청 등 중앙정부·지자체 사업의 창업지원 업무 경험</w:t>
       </w:r>
     </w:p>
     <w:p>
@@ -592,7 +615,7 @@
                 <w:sz w:val="18"/>
                 <w:szCs w:val="18"/>
               </w:rPr>
-              <w:t xml:space="preserve">경영기획 · 경영평가 · 기관홍보</w:t>
+              <w:t xml:space="preserve">경영기획 · 예산 · 대외협력 · 경영평가 · 기관홍보</w:t>
             </w:r>
           </w:p>
         </w:tc>
@@ -1107,7 +1130,7 @@
                 <w:sz w:val="22"/>
                 <w:szCs w:val="22"/>
               </w:rPr>
-              <w:t xml:space="preserve">2011–2015   </w:t>
+              <w:t xml:space="preserve">2011–2016   </w:t>
             </w:r>
             <w:r>
               <w:rPr>

</xml_diff>

<commit_message>
Refine 2011-2016 Experience details and fix MBO/KPI placement
Add the (인천정보산업진흥원) affiliation under the 2011-2016 period,
move the MBO/KPI performance system item into 2011-2016 (right
before "기관 운영 및 제도 개선") and replace the 2016-2019 duplicate
with "통합법인 부서별 직원 성과평가 체계 설계 및 운영", tighten a few
task descriptions per updated content, and reduce line-height/spacing
on wrapped sub-item text. Applied the same content changes to the CV
file.
</commit_message>
<xml_diff>
--- a/이은주_CV_2026.docx
+++ b/이은주_CV_2026.docx
@@ -1117,7 +1117,7 @@
           </w:tcPr>
           <w:p>
             <w:pPr>
-              <w:spacing w:after="120" w:before="0"/>
+              <w:spacing w:after="20" w:before="0"/>
             </w:pPr>
             <w:r>
               <w:rPr>
@@ -1144,6 +1144,24 @@
                 <w:szCs w:val="22"/>
               </w:rPr>
               <w:t xml:space="preserve">경영기획·예산·대외협력·기관홍보</w:t>
+            </w:r>
+          </w:p>
+          <w:p>
+            <w:pPr>
+              <w:spacing w:after="100" w:before="0"/>
+            </w:pPr>
+            <w:r>
+              <w:rPr>
+                <w:rFonts w:ascii="Malgun Gothic" w:cs="Malgun Gothic" w:eastAsia="Malgun Gothic" w:hAnsi="Malgun Gothic"/>
+                <w:b w:val="false"/>
+                <w:bCs w:val="false"/>
+                <w:i w:val="false"/>
+                <w:iCs w:val="false"/>
+                <w:color w:val="6B7280"/>
+                <w:sz w:val="17"/>
+                <w:szCs w:val="17"/>
+              </w:rPr>
+              <w:t xml:space="preserve">(인천정보산업진흥원)</w:t>
             </w:r>
           </w:p>
           <w:p>
@@ -1381,7 +1399,7 @@
                 <w:sz w:val="19"/>
                 <w:szCs w:val="19"/>
               </w:rPr>
-              <w:t xml:space="preserve">경영혁신방안 등 주요 현안자료 작성 및 유관부서·이해관계자 대응</w:t>
+              <w:t xml:space="preserve">경영혁신방안 등 주요 현안자료 작성 및 이해관계자 대응</w:t>
             </w:r>
           </w:p>
           <w:p>
@@ -1404,7 +1422,7 @@
                 <w:sz w:val="19"/>
                 <w:szCs w:val="19"/>
               </w:rPr>
-              <w:t xml:space="preserve">기관 MOU 체결</w:t>
+              <w:t xml:space="preserve">기관 MOU 체결 및 기관장 가입 단체 및 협회 등 관리</w:t>
             </w:r>
           </w:p>
           <w:p>
@@ -1473,7 +1491,7 @@
                 <w:sz w:val="19"/>
                 <w:szCs w:val="19"/>
               </w:rPr>
-              <w:t xml:space="preserve">6. 조직 및 경영회의 운영</w:t>
+              <w:t xml:space="preserve">6. 경영전략 수립지원, 조직 및 경영회의 운영</w:t>
             </w:r>
           </w:p>
           <w:p>
@@ -1496,7 +1514,30 @@
                 <w:sz w:val="19"/>
                 <w:szCs w:val="19"/>
               </w:rPr>
-              <w:t xml:space="preserve">정기 본부·부장회의, 신년 업무보고, 연간 주요실적 및 중장기 업무보고 등 주요 경영회의 운영</w:t>
+              <w:t xml:space="preserve">정기 본부·부장회의, 신년 업무보고, 중장기 업무보고 등 주요 경영회의 운영, 조직개편TFT 운영</w:t>
+            </w:r>
+          </w:p>
+          <w:p>
+            <w:pPr>
+              <w:spacing w:after="60"/>
+            </w:pPr>
+          </w:p>
+          <w:p>
+            <w:pPr>
+              <w:spacing w:after="40" w:before="0"/>
+            </w:pPr>
+            <w:r>
+              <w:rPr>
+                <w:rFonts w:ascii="Malgun Gothic" w:cs="Malgun Gothic" w:eastAsia="Malgun Gothic" w:hAnsi="Malgun Gothic"/>
+                <w:b/>
+                <w:bCs/>
+                <w:i w:val="false"/>
+                <w:iCs w:val="false"/>
+                <w:color w:val="1A1A1A"/>
+                <w:sz w:val="19"/>
+                <w:szCs w:val="19"/>
+              </w:rPr>
+              <w:t xml:space="preserve">7. 기관 홍보 및 대외 커뮤니케이션</w:t>
             </w:r>
           </w:p>
           <w:p>
@@ -1519,30 +1560,7 @@
                 <w:sz w:val="19"/>
                 <w:szCs w:val="19"/>
               </w:rPr>
-              <w:t xml:space="preserve">조직개편 TFT 지원</w:t>
-            </w:r>
-          </w:p>
-          <w:p>
-            <w:pPr>
-              <w:spacing w:after="60"/>
-            </w:pPr>
-          </w:p>
-          <w:p>
-            <w:pPr>
-              <w:spacing w:after="40" w:before="0"/>
-            </w:pPr>
-            <w:r>
-              <w:rPr>
-                <w:rFonts w:ascii="Malgun Gothic" w:cs="Malgun Gothic" w:eastAsia="Malgun Gothic" w:hAnsi="Malgun Gothic"/>
-                <w:b/>
-                <w:bCs/>
-                <w:i w:val="false"/>
-                <w:iCs w:val="false"/>
-                <w:color w:val="1A1A1A"/>
-                <w:sz w:val="19"/>
-                <w:szCs w:val="19"/>
-              </w:rPr>
-              <w:t xml:space="preserve">7. 기관 홍보 및 대외 커뮤니케이션</w:t>
+              <w:t xml:space="preserve">뉴스레터·브로슈어·백서·홍보영상·CI 등 홍보자료 제작 및 관리</w:t>
             </w:r>
           </w:p>
           <w:p>
@@ -1565,7 +1583,30 @@
                 <w:sz w:val="19"/>
                 <w:szCs w:val="19"/>
               </w:rPr>
-              <w:t xml:space="preserve">뉴스레터·브로슈어·백서·홍보영상·CI 등 홍보자료 제작 및 관리</w:t>
+              <w:t xml:space="preserve">홈페이지·블로그·페이스북·유튜브 등 홍보채널 운영</w:t>
+            </w:r>
+          </w:p>
+          <w:p>
+            <w:pPr>
+              <w:spacing w:after="60"/>
+            </w:pPr>
+          </w:p>
+          <w:p>
+            <w:pPr>
+              <w:spacing w:after="40" w:before="0"/>
+            </w:pPr>
+            <w:r>
+              <w:rPr>
+                <w:rFonts w:ascii="Malgun Gothic" w:cs="Malgun Gothic" w:eastAsia="Malgun Gothic" w:hAnsi="Malgun Gothic"/>
+                <w:b/>
+                <w:bCs/>
+                <w:i w:val="false"/>
+                <w:iCs w:val="false"/>
+                <w:color w:val="1A1A1A"/>
+                <w:sz w:val="19"/>
+                <w:szCs w:val="19"/>
+              </w:rPr>
+              <w:t xml:space="preserve">8. 언론 및 기관장 대외홍보</w:t>
             </w:r>
           </w:p>
           <w:p>
@@ -1588,30 +1629,7 @@
                 <w:sz w:val="19"/>
                 <w:szCs w:val="19"/>
               </w:rPr>
-              <w:t xml:space="preserve">홈페이지·블로그·페이스북·유튜브 등 홍보채널 운영</w:t>
-            </w:r>
-          </w:p>
-          <w:p>
-            <w:pPr>
-              <w:spacing w:after="60"/>
-            </w:pPr>
-          </w:p>
-          <w:p>
-            <w:pPr>
-              <w:spacing w:after="40" w:before="0"/>
-            </w:pPr>
-            <w:r>
-              <w:rPr>
-                <w:rFonts w:ascii="Malgun Gothic" w:cs="Malgun Gothic" w:eastAsia="Malgun Gothic" w:hAnsi="Malgun Gothic"/>
-                <w:b/>
-                <w:bCs/>
-                <w:i w:val="false"/>
-                <w:iCs w:val="false"/>
-                <w:color w:val="1A1A1A"/>
-                <w:sz w:val="19"/>
-                <w:szCs w:val="19"/>
-              </w:rPr>
-              <w:t xml:space="preserve">8. 언론 및 기관장 대외홍보</w:t>
+              <w:t xml:space="preserve">보도자료 작성·검수·배포, 언론사 및 기자 대응, 기자간담회 운영</w:t>
             </w:r>
           </w:p>
           <w:p>
@@ -1634,7 +1652,30 @@
                 <w:sz w:val="19"/>
                 <w:szCs w:val="19"/>
               </w:rPr>
-              <w:t xml:space="preserve">보도자료 작성·검수·배포, 언론사 및 기자 대응</w:t>
+              <w:t xml:space="preserve">기관장 인터뷰·기고문·대외행사 인사말 및 의전 지원</w:t>
+            </w:r>
+          </w:p>
+          <w:p>
+            <w:pPr>
+              <w:spacing w:after="60"/>
+            </w:pPr>
+          </w:p>
+          <w:p>
+            <w:pPr>
+              <w:spacing w:after="40" w:before="0"/>
+            </w:pPr>
+            <w:r>
+              <w:rPr>
+                <w:rFonts w:ascii="Malgun Gothic" w:cs="Malgun Gothic" w:eastAsia="Malgun Gothic" w:hAnsi="Malgun Gothic"/>
+                <w:b/>
+                <w:bCs/>
+                <w:i w:val="false"/>
+                <w:iCs w:val="false"/>
+                <w:color w:val="1A1A1A"/>
+                <w:sz w:val="19"/>
+                <w:szCs w:val="19"/>
+              </w:rPr>
+              <w:t xml:space="preserve">9. MBO/KPI 성과평가체계 설계 및 운영</w:t>
             </w:r>
           </w:p>
           <w:p>
@@ -1657,7 +1698,30 @@
                 <w:sz w:val="19"/>
                 <w:szCs w:val="19"/>
               </w:rPr>
-              <w:t xml:space="preserve">기자간담회 운영</w:t>
+              <w:t xml:space="preserve">5개 본부 및 9개 부서</w:t>
+            </w:r>
+          </w:p>
+          <w:p>
+            <w:pPr>
+              <w:spacing w:after="60"/>
+            </w:pPr>
+          </w:p>
+          <w:p>
+            <w:pPr>
+              <w:spacing w:after="40" w:before="0"/>
+            </w:pPr>
+            <w:r>
+              <w:rPr>
+                <w:rFonts w:ascii="Malgun Gothic" w:cs="Malgun Gothic" w:eastAsia="Malgun Gothic" w:hAnsi="Malgun Gothic"/>
+                <w:b/>
+                <w:bCs/>
+                <w:i w:val="false"/>
+                <w:iCs w:val="false"/>
+                <w:color w:val="1A1A1A"/>
+                <w:sz w:val="19"/>
+                <w:szCs w:val="19"/>
+              </w:rPr>
+              <w:t xml:space="preserve">10. 기관 운영 및 제도 개선</w:t>
             </w:r>
           </w:p>
           <w:p>
@@ -1680,99 +1744,7 @@
                 <w:sz w:val="19"/>
                 <w:szCs w:val="19"/>
               </w:rPr>
-              <w:t xml:space="preserve">기관장 인터뷰·기고문·대외행사 인사말 및 의전 지원</w:t>
-            </w:r>
-          </w:p>
-          <w:p>
-            <w:pPr>
-              <w:spacing w:after="60"/>
-            </w:pPr>
-          </w:p>
-          <w:p>
-            <w:pPr>
-              <w:spacing w:after="40" w:before="0"/>
-            </w:pPr>
-            <w:r>
-              <w:rPr>
-                <w:rFonts w:ascii="Malgun Gothic" w:cs="Malgun Gothic" w:eastAsia="Malgun Gothic" w:hAnsi="Malgun Gothic"/>
-                <w:b/>
-                <w:bCs/>
-                <w:i w:val="false"/>
-                <w:iCs w:val="false"/>
-                <w:color w:val="1A1A1A"/>
-                <w:sz w:val="19"/>
-                <w:szCs w:val="19"/>
-              </w:rPr>
-              <w:t xml:space="preserve">9. 기관 운영 및 제도 개선</w:t>
-            </w:r>
-          </w:p>
-          <w:p>
-            <w:pPr>
-              <w:pStyle w:val="ListParagraph"/>
-              <w:numPr>
-                <w:ilvl w:val="0"/>
-                <w:numId w:val="2"/>
-              </w:numPr>
-              <w:spacing w:after="60"/>
-            </w:pPr>
-            <w:r>
-              <w:rPr>
-                <w:rFonts w:ascii="Malgun Gothic" w:cs="Malgun Gothic" w:eastAsia="Malgun Gothic" w:hAnsi="Malgun Gothic"/>
-                <w:b w:val="false"/>
-                <w:bCs w:val="false"/>
-                <w:i w:val="false"/>
-                <w:iCs w:val="false"/>
-                <w:color w:val="1A1A1A"/>
-                <w:sz w:val="19"/>
-                <w:szCs w:val="19"/>
-              </w:rPr>
-              <w:t xml:space="preserve">전자문서 시스템 관리</w:t>
-            </w:r>
-          </w:p>
-          <w:p>
-            <w:pPr>
-              <w:pStyle w:val="ListParagraph"/>
-              <w:numPr>
-                <w:ilvl w:val="0"/>
-                <w:numId w:val="2"/>
-              </w:numPr>
-              <w:spacing w:after="60"/>
-            </w:pPr>
-            <w:r>
-              <w:rPr>
-                <w:rFonts w:ascii="Malgun Gothic" w:cs="Malgun Gothic" w:eastAsia="Malgun Gothic" w:hAnsi="Malgun Gothic"/>
-                <w:b w:val="false"/>
-                <w:bCs w:val="false"/>
-                <w:i w:val="false"/>
-                <w:iCs w:val="false"/>
-                <w:color w:val="1A1A1A"/>
-                <w:sz w:val="19"/>
-                <w:szCs w:val="19"/>
-              </w:rPr>
-              <w:t xml:space="preserve">정부 3.0 관련 개인정보보호·공공데이터 업무</w:t>
-            </w:r>
-          </w:p>
-          <w:p>
-            <w:pPr>
-              <w:pStyle w:val="ListParagraph"/>
-              <w:numPr>
-                <w:ilvl w:val="0"/>
-                <w:numId w:val="2"/>
-              </w:numPr>
-              <w:spacing w:after="60"/>
-            </w:pPr>
-            <w:r>
-              <w:rPr>
-                <w:rFonts w:ascii="Malgun Gothic" w:cs="Malgun Gothic" w:eastAsia="Malgun Gothic" w:hAnsi="Malgun Gothic"/>
-                <w:b w:val="false"/>
-                <w:bCs w:val="false"/>
-                <w:i w:val="false"/>
-                <w:iCs w:val="false"/>
-                <w:color w:val="1A1A1A"/>
-                <w:sz w:val="19"/>
-                <w:szCs w:val="19"/>
-              </w:rPr>
-              <w:t xml:space="preserve">집중근무시간제 제정·운영 및 주요 현안 대응</w:t>
+              <w:t xml:space="preserve">전자문서 시스템 관리, 정부 3.0 관련 개인정보보호 등 업무, 집중근무시간제 제정 등</w:t>
             </w:r>
           </w:p>
         </w:tc>
@@ -1926,7 +1898,7 @@
                 <w:sz w:val="19"/>
                 <w:szCs w:val="19"/>
               </w:rPr>
-              <w:t xml:space="preserve">MBO/KPI 성과평가체계 설계 및 운영 (5개 본부 및 9개 부서)</w:t>
+              <w:t xml:space="preserve">통합법인 부서별 직원 성과평가 체계 설계 및 운영</w:t>
             </w:r>
           </w:p>
           <w:p>

</xml_diff>

<commit_message>
Move institution to Career Summary period column, split 단지지원팀 row
Show the affiliation only under the 2011-2016 period (removed from
every 소속/직급 cell to avoid repeating it 6 times), correct
2016-2018/기획평가팀 · 주임, and split 단지지원팀 into its two
periods/titles (2018-2021 대리, 2021-2023 과장) within a single row.
Also raise the specificity of the Experience sub-item bullet rule so
its line-height/margin reliably win over the shared .bullet-list
rule. Same Career Summary updates applied to the CV file.
</commit_message>
<xml_diff>
--- a/이은주_CV_2026.docx
+++ b/이은주_CV_2026.docx
@@ -563,6 +563,23 @@
               </w:rPr>
               <w:t xml:space="preserve">2011–2016</w:t>
             </w:r>
+            <w:r>
+              <w:br/>
+              <w:t xml:space="preserve"/>
+            </w:r>
+            <w:r>
+              <w:rPr>
+                <w:rFonts w:ascii="Malgun Gothic" w:cs="Malgun Gothic" w:eastAsia="Malgun Gothic" w:hAnsi="Malgun Gothic"/>
+                <w:b w:val="false"/>
+                <w:bCs w:val="false"/>
+                <w:i w:val="false"/>
+                <w:iCs w:val="false"/>
+                <w:color w:val="6B7280"/>
+                <w:sz w:val="15"/>
+                <w:szCs w:val="15"/>
+              </w:rPr>
+              <w:t xml:space="preserve">(인천정보산업진흥원)</w:t>
+            </w:r>
           </w:p>
         </w:tc>
         <w:tc>
@@ -588,7 +605,7 @@
                 <w:sz w:val="18"/>
                 <w:szCs w:val="18"/>
               </w:rPr>
-              <w:t xml:space="preserve">인천정보산업진흥원 / 기획조정팀 · 주임</w:t>
+              <w:t xml:space="preserve">기획조정팀 · 주임</w:t>
             </w:r>
           </w:p>
         </w:tc>
@@ -644,7 +661,7 @@
                 <w:sz w:val="18"/>
                 <w:szCs w:val="18"/>
               </w:rPr>
-              <w:t xml:space="preserve">2016–2019</w:t>
+              <w:t xml:space="preserve">2016–2018</w:t>
             </w:r>
           </w:p>
         </w:tc>
@@ -671,7 +688,7 @@
                 <w:sz w:val="18"/>
                 <w:szCs w:val="18"/>
               </w:rPr>
-              <w:t xml:space="preserve">인천테크노파크 / 기획평가팀 · 대리</w:t>
+              <w:t xml:space="preserve">기획평가팀 · 주임</w:t>
             </w:r>
           </w:p>
         </w:tc>
@@ -727,7 +744,24 @@
                 <w:sz w:val="18"/>
                 <w:szCs w:val="18"/>
               </w:rPr>
-              <w:t xml:space="preserve">2019–2023</w:t>
+              <w:t xml:space="preserve">2018–2021</w:t>
+            </w:r>
+            <w:r>
+              <w:br/>
+              <w:t xml:space="preserve"/>
+            </w:r>
+            <w:r>
+              <w:rPr>
+                <w:rFonts w:ascii="Malgun Gothic" w:cs="Malgun Gothic" w:eastAsia="Malgun Gothic" w:hAnsi="Malgun Gothic"/>
+                <w:b w:val="false"/>
+                <w:bCs w:val="false"/>
+                <w:i w:val="false"/>
+                <w:iCs w:val="false"/>
+                <w:color w:val="1A1A1A"/>
+                <w:sz w:val="18"/>
+                <w:szCs w:val="18"/>
+              </w:rPr>
+              <w:t xml:space="preserve">2021–2023</w:t>
             </w:r>
           </w:p>
         </w:tc>
@@ -754,7 +788,24 @@
                 <w:sz w:val="18"/>
                 <w:szCs w:val="18"/>
               </w:rPr>
-              <w:t xml:space="preserve">인천테크노파크 / 단지지원팀 · 과장</w:t>
+              <w:t xml:space="preserve">단지지원팀 · 대리</w:t>
+            </w:r>
+            <w:r>
+              <w:br/>
+              <w:t xml:space="preserve"/>
+            </w:r>
+            <w:r>
+              <w:rPr>
+                <w:rFonts w:ascii="Malgun Gothic" w:cs="Malgun Gothic" w:eastAsia="Malgun Gothic" w:hAnsi="Malgun Gothic"/>
+                <w:b w:val="false"/>
+                <w:bCs w:val="false"/>
+                <w:i w:val="false"/>
+                <w:iCs w:val="false"/>
+                <w:color w:val="1A1A1A"/>
+                <w:sz w:val="18"/>
+                <w:szCs w:val="18"/>
+              </w:rPr>
+              <w:t xml:space="preserve">단지지원팀 · 과장</w:t>
             </w:r>
           </w:p>
         </w:tc>
@@ -837,7 +888,7 @@
                 <w:sz w:val="18"/>
                 <w:szCs w:val="18"/>
               </w:rPr>
-              <w:t xml:space="preserve">인천테크노파크 / 혁신창업센터 · 과장</w:t>
+              <w:t xml:space="preserve">혁신창업센터 · 과장</w:t>
             </w:r>
           </w:p>
         </w:tc>
@@ -920,7 +971,7 @@
                 <w:sz w:val="18"/>
                 <w:szCs w:val="18"/>
               </w:rPr>
-              <w:t xml:space="preserve">인천테크노파크 / 혁신창업센터 · 차장</w:t>
+              <w:t xml:space="preserve">혁신창업센터 · 차장</w:t>
             </w:r>
           </w:p>
         </w:tc>
@@ -1003,7 +1054,7 @@
                 <w:sz w:val="18"/>
                 <w:szCs w:val="18"/>
               </w:rPr>
-              <w:t xml:space="preserve">인천테크노파크 / 혁신창업센터 · 차장</w:t>
+              <w:t xml:space="preserve">혁신창업센터 · 차장</w:t>
             </w:r>
           </w:p>
         </w:tc>

</xml_diff>

<commit_message>
Add institution tag under Career Summary's 2016-2018 period
Show (인천테크노파크) under the 2016-2018 row only, matching the
existing 2011-2016 pattern. Same change applied to the CV file.
</commit_message>
<xml_diff>
--- a/이은주_CV_2026.docx
+++ b/이은주_CV_2026.docx
@@ -662,6 +662,23 @@
                 <w:szCs w:val="18"/>
               </w:rPr>
               <w:t xml:space="preserve">2016–2018</w:t>
+            </w:r>
+            <w:r>
+              <w:br/>
+              <w:t xml:space="preserve"/>
+            </w:r>
+            <w:r>
+              <w:rPr>
+                <w:rFonts w:ascii="Malgun Gothic" w:cs="Malgun Gothic" w:eastAsia="Malgun Gothic" w:hAnsi="Malgun Gothic"/>
+                <w:b w:val="false"/>
+                <w:bCs w:val="false"/>
+                <w:i w:val="false"/>
+                <w:iCs w:val="false"/>
+                <w:color w:val="6B7280"/>
+                <w:sz w:val="15"/>
+                <w:szCs w:val="15"/>
+              </w:rPr>
+              <w:t xml:space="preserve">(인천테크노파크)</w:t>
             </w:r>
           </w:p>
         </w:tc>

</xml_diff>

<commit_message>
Translate nav/section titles to Korean, remove language field, fix experience dates
- Translate nav and section titles: RESUME->경력 요약, EXPERIENCE->경력 상세, PROFILE->기본 정보, CONTACT->연락처, ABOUT ME->소개
- Remove 언어(영어 중급) row from Profile section
- Fix Experience period labels: 2016-2019->2016-2018, 2019-2023->2018-2023
- Sync same date/field changes into CV docx/pdf
</commit_message>
<xml_diff>
--- a/이은주_CV_2026.docx
+++ b/이은주_CV_2026.docx
@@ -1871,7 +1871,7 @@
                 <w:sz w:val="22"/>
                 <w:szCs w:val="22"/>
               </w:rPr>
-              <w:t xml:space="preserve">2016–2019   </w:t>
+              <w:t xml:space="preserve">2016–2018   </w:t>
             </w:r>
             <w:r>
               <w:rPr>
@@ -2163,7 +2163,7 @@
                 <w:sz w:val="22"/>
                 <w:szCs w:val="22"/>
               </w:rPr>
-              <w:t xml:space="preserve">2019–2023   </w:t>
+              <w:t xml:space="preserve">2018–2023   </w:t>
             </w:r>
             <w:r>
               <w:rPr>
@@ -4101,37 +4101,6 @@
           <w:szCs w:val="19"/>
         </w:rPr>
         <w:t xml:space="preserve">창업보육전문매니저 (2024.05.18. 취득)</w:t>
-      </w:r>
-    </w:p>
-    <w:p>
-      <w:pPr>
-        <w:spacing w:after="100"/>
-      </w:pPr>
-      <w:r>
-        <w:rPr>
-          <w:rFonts w:ascii="Malgun Gothic" w:cs="Malgun Gothic" w:eastAsia="Malgun Gothic" w:hAnsi="Malgun Gothic"/>
-          <w:b/>
-          <w:bCs/>
-          <w:i w:val="false"/>
-          <w:iCs w:val="false"/>
-          <w:color w:val="6B7280"/>
-          <w:sz w:val="19"/>
-          <w:szCs w:val="19"/>
-        </w:rPr>
-        <w:t xml:space="preserve">언어   </w:t>
-      </w:r>
-      <w:r>
-        <w:rPr>
-          <w:rFonts w:ascii="Malgun Gothic" w:cs="Malgun Gothic" w:eastAsia="Malgun Gothic" w:hAnsi="Malgun Gothic"/>
-          <w:b w:val="false"/>
-          <w:bCs w:val="false"/>
-          <w:i w:val="false"/>
-          <w:iCs w:val="false"/>
-          <w:color w:val="1A1A1A"/>
-          <w:sz w:val="19"/>
-          <w:szCs w:val="19"/>
-        </w:rPr>
-        <w:t xml:space="preserve">영어 (중급)</w:t>
       </w:r>
     </w:p>
     <w:p>

</xml_diff>

<commit_message>
Add mayoral commendation achievement to 2023-2026 experience
- Add "민간주도 스타트업 육성 기여로 인천시장 표창 수상('25)" to 2023-2026 experience's 주요 성과 list
- Sync same addition into CV docx/pdf
</commit_message>
<xml_diff>
--- a/이은주_CV_2026.docx
+++ b/이은주_CV_2026.docx
@@ -2735,6 +2735,29 @@
                 <w:szCs w:val="19"/>
               </w:rPr>
               <w:t xml:space="preserve">민간 액셀러레이터 협의회 발족 등 민관 협력 체계 구축('25.1~)</w:t>
+            </w:r>
+          </w:p>
+          <w:p>
+            <w:pPr>
+              <w:pStyle w:val="ListParagraph"/>
+              <w:numPr>
+                <w:ilvl w:val="0"/>
+                <w:numId w:val="2"/>
+              </w:numPr>
+              <w:spacing w:after="60"/>
+            </w:pPr>
+            <w:r>
+              <w:rPr>
+                <w:rFonts w:ascii="Malgun Gothic" w:cs="Malgun Gothic" w:eastAsia="Malgun Gothic" w:hAnsi="Malgun Gothic"/>
+                <w:b w:val="false"/>
+                <w:bCs w:val="false"/>
+                <w:i w:val="false"/>
+                <w:iCs w:val="false"/>
+                <w:color w:val="1A1A1A"/>
+                <w:sz w:val="19"/>
+                <w:szCs w:val="19"/>
+              </w:rPr>
+              <w:t xml:space="preserve">민간주도 스타트업 육성 기여로 인천시장 표창 수상('25)</w:t>
             </w:r>
           </w:p>
         </w:tc>

</xml_diff>

<commit_message>
Merge duplicate Resume highlight bullets into one
- Combine the two overlapping public-sector/startup-support experience bullets into a single consolidated bullet
- Sync same change into CV docx/pdf
</commit_message>
<xml_diff>
--- a/이은주_CV_2026.docx
+++ b/이은주_CV_2026.docx
@@ -336,7 +336,7 @@
           <w:sz w:val="19"/>
           <w:szCs w:val="19"/>
         </w:rPr>
-        <w:t xml:space="preserve">중앙정부·인천광역시·인천경제자유구역청 등 공공부문 사업의 기획·운영 경험</w:t>
+        <w:t xml:space="preserve">중앙정부·인천광역시·인천경제자유구역청 등 공공부문 사업의 기획·운영, 창업지원 운영 경험</w:t>
       </w:r>
     </w:p>
     <w:p>
@@ -360,29 +360,6 @@
           <w:szCs w:val="19"/>
         </w:rPr>
         <w:t xml:space="preserve">경영기획·성과관리 → 자산운용·임대관리 → 창업지원·창업생태계·민관협력으로 업무 영역 확대</w:t>
-      </w:r>
-    </w:p>
-    <w:p>
-      <w:pPr>
-        <w:pStyle w:val="ListParagraph"/>
-        <w:numPr>
-          <w:ilvl w:val="0"/>
-          <w:numId w:val="2"/>
-        </w:numPr>
-        <w:spacing w:after="60"/>
-      </w:pPr>
-      <w:r>
-        <w:rPr>
-          <w:rFonts w:ascii="Malgun Gothic" w:cs="Malgun Gothic" w:eastAsia="Malgun Gothic" w:hAnsi="Malgun Gothic"/>
-          <w:b w:val="false"/>
-          <w:bCs w:val="false"/>
-          <w:i w:val="false"/>
-          <w:iCs w:val="false"/>
-          <w:color w:val="1A1A1A"/>
-          <w:sz w:val="19"/>
-          <w:szCs w:val="19"/>
-        </w:rPr>
-        <w:t xml:space="preserve">중소벤처기업부·인천광역시·인천경제자유구역청 등 중앙정부·지자체 사업의 창업지원 업무 경험</w:t>
       </w:r>
     </w:p>
     <w:p>

</xml_diff>